<commit_message>
Live demo runbook, and leakage figures that match what the command prints
The runbook is the sheet to keep beside the laptop: eleven commands in order, what
each prints, what to say while it runs, the optional deep cuts, a failure table, and
the day-before install for a machine that has never seen the project. Durations are
measured from a clean checkout, not estimated -- the whole demo is under seven seconds
of computation, so the pacing is entirely the presenter's.

While verifying the optional leakage command I found the speech quoting 0.603 as the
honest AUC. That is the paper's configuration; a live run prints 0.606, and a panel
that asks for the command would see a number the script did not predict. Both
documents now say about 0.60, name the live figures, and keep the paper's 0.603 where
the paper is what is being quoted.

Co-Authored-By: Claude Opus 5 <noreply@anthropic.com>
</commit_message>
<xml_diff>
--- a/presentation/RetainIQ_Panel_Speech_and_QA.docx
+++ b/presentation/RetainIQ_Panel_Speech_and_QA.docx
@@ -1167,7 +1167,7 @@
           <w:sz w:val="20"/>
           <w:szCs w:val="20"/>
         </w:rPr>
-        <w:t xml:space="preserve">Three model cards, the training-discipline panel, the iteration timeline.   ·   3:41 – 5:41   ·   261 words</w:t>
+        <w:t xml:space="preserve">Three model cards, the training-discipline panel, the iteration timeline.   ·   3:41 – 5:42   ·   262 words</w:t>
       </w:r>
     </w:p>
     <w:p>
@@ -1291,16 +1291,16 @@
           <w:sz w:val="25"/>
           <w:szCs w:val="25"/>
         </w:rPr>
-        <w:t xml:space="preserve">; done honestly, </w:t>
-      </w:r>
-      <w:r>
-        <w:rPr>
-          <w:b/>
-          <w:bCs/>
-          <w:sz w:val="25"/>
-          <w:szCs w:val="25"/>
-        </w:rPr>
-        <w:t xml:space="preserve">0.603</w:t>
+        <w:t xml:space="preserve">; done honestly, about </w:t>
+      </w:r>
+      <w:r>
+        <w:rPr>
+          <w:b/>
+          <w:bCs/>
+          <w:sz w:val="25"/>
+          <w:szCs w:val="25"/>
+        </w:rPr>
+        <w:t xml:space="preserve">0.60</w:t>
       </w:r>
       <w:r>
         <w:rPr>
@@ -1446,7 +1446,7 @@
           <w:sz w:val="20"/>
           <w:szCs w:val="20"/>
         </w:rPr>
-        <w:t xml:space="preserve">ROC curve, confusion matrix, feature importance, metric tiles, survival table.   ·   5:41 – 7:14   ·   200 words</w:t>
+        <w:t xml:space="preserve">ROC curve, confusion matrix, feature importance, metric tiles, survival table.   ·   5:42 – 7:15   ·   200 words</w:t>
       </w:r>
     </w:p>
     <w:p>
@@ -1761,7 +1761,7 @@
           <w:sz w:val="20"/>
           <w:szCs w:val="20"/>
         </w:rPr>
-        <w:t xml:space="preserve">Policy value chart, the correlation table, the four stat cards.   ·   7:14 – 9:41   ·   321 words</w:t>
+        <w:t xml:space="preserve">Policy value chart, the correlation table, the four stat cards.   ·   7:15 – 9:41   ·   321 words</w:t>
       </w:r>
     </w:p>
     <w:p>
@@ -2112,7 +2112,7 @@
           <w:sz w:val="20"/>
           <w:szCs w:val="20"/>
         </w:rPr>
-        <w:t xml:space="preserve">Dashboard and report screenshots, terminal output, code, engineering chips.   ·   9:41 – 11:17   ·   208 words</w:t>
+        <w:t xml:space="preserve">Dashboard and report screenshots, terminal output, code, engineering chips.   ·   9:41 – 11:18   ·   208 words</w:t>
       </w:r>
     </w:p>
     <w:p>
@@ -2283,7 +2283,7 @@
           <w:sz w:val="20"/>
           <w:szCs w:val="20"/>
         </w:rPr>
-        <w:t xml:space="preserve">Three takeaways, production readiness, next steps, references and DOIs.   ·   11:17 – 12:51   ·   201 words</w:t>
+        <w:t xml:space="preserve">Three takeaways, production readiness, next steps, references and DOIs.   ·   11:18 – 12:51   ·   201 words</w:t>
       </w:r>
     </w:p>
     <w:p>
@@ -2511,7 +2511,7 @@
           <w:b w:val="false"/>
           <w:bCs w:val="false"/>
         </w:rPr>
-        <w:t xml:space="preserve"> after slide 4, add the leakage figure (0.954 against 0.603) and what caused it; after slide 6, add the offer-ladder result and why choosing the offer beats choosing the customer; on slide 7, run the demo live.</w:t>
+        <w:t xml:space="preserve"> after slide 4, add the leakage figure (0.954 against about 0.60) and what caused it; after slide 6, add the offer-ladder result and why choosing the offer beats choosing the customer; on slide 7, run the demo live.</w:t>
       </w:r>
     </w:p>
     <w:p>
@@ -2922,7 +2922,7 @@
                 <w:b w:val="false"/>
                 <w:bCs w:val="false"/>
               </w:rPr>
-              <w:t xml:space="preserve">0.603 vs 0.954</w:t>
+              <w:t xml:space="preserve">≈0.60 vs 0.954</w:t>
             </w:r>
           </w:p>
         </w:tc>
@@ -5188,7 +5188,7 @@
           <w:b w:val="false"/>
           <w:bCs w:val="false"/>
         </w:rPr>
-        <w:t xml:space="preserve">Every fact carries an occurrence time and an availability time, and features read only what was available at the decision point. There is an automated leakage suite in CI, including canary injection. Without it, the same model scores AUC 0.954 instead of 0.603.</w:t>
+        <w:t xml:space="preserve">Every fact carries an occurrence time and an availability time, and features read only what was available at the decision point. There is an automated leakage suite in CI, including canary injection. Without it, the same model scores AUC 0.954 instead of about 0.60. One command proves it live: `python -m retainiq.experiments.leakage_penalty` prints 0.606 filtered correctly, 0.615 ignoring availability lag, and 0.954 with no filter.</w:t>
       </w:r>
     </w:p>
     <w:p>
@@ -6256,7 +6256,7 @@
           <w:b w:val="false"/>
           <w:bCs w:val="false"/>
         </w:rPr>
-        <w:t xml:space="preserve">Overfitting is learning noise in the training data; leakage is training on information that would not have been available at prediction time. Leakage inflated our AUC from 0.603 to 0.954.</w:t>
+        <w:t xml:space="preserve">Overfitting is learning noise in the training data; leakage is training on information that would not have been available at prediction time. Leakage inflated our AUC from about 0.60 to 0.954.</w:t>
       </w:r>
     </w:p>
     <w:p>
@@ -6896,7 +6896,7 @@
                 <w:b w:val="false"/>
                 <w:bCs w:val="false"/>
               </w:rPr>
-              <w:t xml:space="preserve">0.603 honest against 0.954 leaked. Value-at-risk and churn-risk top deciles overlap by only 21%.</w:t>
+              <w:t xml:space="preserve">≈0.60 honest against 0.954 leaked (the paper reports 0.603 for its configuration). Value-at-risk and churn-risk top deciles overlap by only 21%.</w:t>
             </w:r>
           </w:p>
         </w:tc>

</xml_diff>